<commit_message>
Ficha modos normales del muelle simplificada
Co-Authored-By: Claude Opus 5.5 <noreply@anthropic.com>
Claude-Session: https://claude.ai/code/session_01GdrGkTkQ1SpY6BWmf3EBwF
</commit_message>
<xml_diff>
--- a/fichas/fai-modos-muelle.docx
+++ b/fichas/fai-modos-muelle.docx
@@ -43,7 +43,7 @@
         <w:jc w:val="both"/>
       </w:pPr>
       <w:r>
-        <w:t xml:space="preserve">Excitar las ondas estacionarias longitudinales de un muelle tenso, unido por un extremo a un vibrador mecánico y por el otro a un soporte fijo, medir las frecuencias de sus modos normales y obtener la velocidad de propagación de las ondas en el muelle. Compararla con la predicha a partir de su constante elástica y su masa.</w:t>
+        <w:t xml:space="preserve">Excitar con un vibrador las ondas estacionarias de un muelle estirado, medir las frecuencias de sus modos normales y obtener de ellas la velocidad de propagación de las ondas en el muelle y su constante elástica.</w:t>
       </w:r>
     </w:p>
     <w:bookmarkEnd w:id="21"/>
@@ -82,7 +82,10 @@
         </m:r>
       </m:oMath>
       <w:r>
-        <w:t xml:space="preserve">, constante</w:t>
+        <w:t xml:space="preserve"> </w:t>
+      </w:r>
+      <w:r>
+        <w:t xml:space="preserve">y constante</w:t>
       </w:r>
       <w:r>
         <w:t xml:space="preserve"> </w:t>
@@ -93,10 +96,7 @@
         </m:r>
       </m:oMath>
       <w:r>
-        <w:t xml:space="preserve"> </w:t>
-      </w:r>
-      <w:r>
-        <w:t xml:space="preserve">y estirado hasta una longitud</w:t>
+        <w:t xml:space="preserve">, estirado hasta una longitud</w:t>
       </w:r>
       <w:r>
         <w:t xml:space="preserve"> </w:t>
@@ -107,17 +107,13 @@
         </m:r>
       </m:oMath>
       <w:r>
-        <w:t xml:space="preserve"> </w:t>
-      </w:r>
-      <w:r>
-        <w:t xml:space="preserve">se comporta como un medio continuo por el que se propagan ondas longitudinales (compresiones y estiramientos de las espiras) con velocidad</w:t>
+        <w:t xml:space="preserve">, se comporta como un medio continuo. Por él se propagan ondas longitudinales, compresiones y estiramientos de las espiras, con velocidad</w:t>
       </w:r>
     </w:p>
     <w:p>
       <w:pPr>
         <w:pStyle w:val="BodyText"/>
-        <w:spacing w:after="120" w:line="276" w:lineRule="auto"/>
-        <w:jc w:val="both"/>
+        <w:spacing w:before="200" w:after="200"/>
       </w:pPr>
       <m:oMathPara>
         <m:oMathParaPr>
@@ -175,15 +171,92 @@
         <w:jc w:val="both"/>
       </w:pPr>
       <w:r>
-        <w:t xml:space="preserve">Si los dos extremos están prácticamente fijos (la amplitud del vibrador es muy pequeña), solo se forman ondas estacionarias cuando en la longitud del muelle cabe un número entero de semilongitudes de onda,</w:t>
+        <w:t xml:space="preserve">Si los dos extremos están prácticamente fijos, porque la amplitud del vibrador es muy pequeña, solo se forman ondas estacionarias cuando en la longitud del muelle cabe un número entero de medias longitudes de onda:</w:t>
+      </w:r>
+    </w:p>
+    <w:p>
+      <w:pPr>
+        <w:pStyle w:val="BodyText"/>
+        <w:spacing w:before="200" w:after="200"/>
+      </w:pPr>
+      <m:oMathPara>
+        <m:oMathParaPr>
+          <m:jc m:val="center"/>
+        </m:oMathParaPr>
+        <m:oMath>
+          <m:r>
+            <m:t>L</m:t>
+          </m:r>
+          <m:r>
+            <m:rPr>
+              <m:sty m:val="p"/>
+            </m:rPr>
+            <m:t>=</m:t>
+          </m:r>
+          <m:r>
+            <m:t>n</m:t>
+          </m:r>
+          <m:r>
+            <m:t> </m:t>
+          </m:r>
+          <m:f>
+            <m:fPr>
+              <m:type m:val="bar"/>
+            </m:fPr>
+            <m:num>
+              <m:sSub>
+                <m:e>
+                  <m:r>
+                    <m:t>λ</m:t>
+                  </m:r>
+                </m:e>
+                <m:sub>
+                  <m:r>
+                    <m:t>n</m:t>
+                  </m:r>
+                </m:sub>
+              </m:sSub>
+            </m:num>
+            <m:den>
+              <m:r>
+                <m:t>2</m:t>
+              </m:r>
+            </m:den>
+          </m:f>
+          <m:r>
+            <m:rPr>
+              <m:sty m:val="p"/>
+            </m:rPr>
+            <m:t>.</m:t>
+          </m:r>
+        </m:oMath>
+      </m:oMathPara>
+    </w:p>
+    <w:p>
+      <w:pPr>
+        <w:pStyle w:val="FirstParagraph"/>
+        <w:spacing w:after="120" w:line="276" w:lineRule="auto"/>
+        <w:jc w:val="both"/>
+      </w:pPr>
+      <w:r>
+        <w:t xml:space="preserve">Como</w:t>
       </w:r>
       <w:r>
         <w:t xml:space="preserve"> </w:t>
       </w:r>
       <m:oMath>
-        <m:r>
-          <m:t>L</m:t>
-        </m:r>
+        <m:sSub>
+          <m:e>
+            <m:r>
+              <m:t>f</m:t>
+            </m:r>
+          </m:e>
+          <m:sub>
+            <m:r>
+              <m:t>n</m:t>
+            </m:r>
+          </m:sub>
+        </m:sSub>
         <m:r>
           <m:rPr>
             <m:sty m:val="p"/>
@@ -191,7 +264,13 @@
           <m:t>=</m:t>
         </m:r>
         <m:r>
-          <m:t>n</m:t>
+          <m:t>v</m:t>
+        </m:r>
+        <m:r>
+          <m:rPr>
+            <m:sty m:val="p"/>
+          </m:rPr>
+          <m:t>/</m:t>
         </m:r>
         <m:sSub>
           <m:e>
@@ -205,25 +284,15 @@
             </m:r>
           </m:sub>
         </m:sSub>
-        <m:r>
-          <m:rPr>
-            <m:sty m:val="p"/>
-          </m:rPr>
-          <m:t>/</m:t>
-        </m:r>
-        <m:r>
-          <m:t>2</m:t>
-        </m:r>
       </m:oMath>
       <w:r>
-        <w:t xml:space="preserve">. Las frecuencias de los modos normales son</w:t>
+        <w:t xml:space="preserve">, las frecuencias de los modos normales son</w:t>
       </w:r>
     </w:p>
     <w:p>
       <w:pPr>
         <w:pStyle w:val="BodyText"/>
-        <w:spacing w:after="120" w:line="276" w:lineRule="auto"/>
-        <w:jc w:val="both"/>
+        <w:spacing w:before="200" w:after="200"/>
       </w:pPr>
       <m:oMathPara>
         <m:oMathParaPr>
@@ -254,12 +323,6 @@
             </m:fPr>
             <m:num>
               <m:r>
-                <m:t>n</m:t>
-              </m:r>
-              <m:r>
-                <m:t> </m:t>
-              </m:r>
-              <m:r>
                 <m:t>v</m:t>
               </m:r>
             </m:num>
@@ -273,13 +336,7 @@
             </m:den>
           </m:f>
           <m:r>
-            <m:rPr>
-              <m:sty m:val="p"/>
-            </m:rPr>
-            <m:t>,</m:t>
-          </m:r>
-          <m:r>
-            <m:t>  </m:t>
+            <m:t> </m:t>
           </m:r>
           <m:r>
             <m:t>n</m:t>
@@ -288,40 +345,7 @@
             <m:rPr>
               <m:sty m:val="p"/>
             </m:rPr>
-            <m:t>=</m:t>
-          </m:r>
-          <m:r>
-            <m:t>1</m:t>
-          </m:r>
-          <m:r>
-            <m:rPr>
-              <m:sty m:val="p"/>
-            </m:rPr>
             <m:t>,</m:t>
-          </m:r>
-          <m:r>
-            <m:t>2</m:t>
-          </m:r>
-          <m:r>
-            <m:rPr>
-              <m:sty m:val="p"/>
-            </m:rPr>
-            <m:t>,</m:t>
-          </m:r>
-          <m:r>
-            <m:t>3</m:t>
-          </m:r>
-          <m:r>
-            <m:rPr>
-              <m:sty m:val="p"/>
-            </m:rPr>
-            <m:t>,</m:t>
-          </m:r>
-          <m:r>
-            <m:rPr>
-              <m:sty m:val="p"/>
-            </m:rPr>
-            <m:t>…</m:t>
           </m:r>
         </m:oMath>
       </m:oMathPara>
@@ -333,7 +357,7 @@
         <w:jc w:val="both"/>
       </w:pPr>
       <w:r>
-        <w:t xml:space="preserve">En el modo</w:t>
+        <w:t xml:space="preserve">con</w:t>
       </w:r>
       <w:r>
         <w:t xml:space="preserve"> </w:t>
@@ -347,7 +371,7 @@
         <w:t xml:space="preserve"> </w:t>
       </w:r>
       <w:r>
-        <w:t xml:space="preserve">se observan</w:t>
+        <w:t xml:space="preserve">= 1, 2, 3… En el modo</w:t>
       </w:r>
       <w:r>
         <w:t xml:space="preserve"> </w:t>
@@ -361,7 +385,21 @@
         <w:t xml:space="preserve"> </w:t>
       </w:r>
       <w:r>
-        <w:t xml:space="preserve">zonas de gran amplitud (vientres) separadas por</w:t>
+        <w:t xml:space="preserve">se ven</w:t>
+      </w:r>
+      <w:r>
+        <w:t xml:space="preserve"> </w:t>
+      </w:r>
+      <m:oMath>
+        <m:r>
+          <m:t>n</m:t>
+        </m:r>
+      </m:oMath>
+      <w:r>
+        <w:t xml:space="preserve"> </w:t>
+      </w:r>
+      <w:r>
+        <w:t xml:space="preserve">zonas de gran amplitud, los vientres, separadas por</w:t>
       </w:r>
       <w:r>
         <w:t xml:space="preserve"> </w:t>
@@ -384,7 +422,7 @@
         <w:t xml:space="preserve"> </w:t>
       </w:r>
       <w:r>
-        <w:t xml:space="preserve">puntos casi quietos (nodos).</w:t>
+        <w:t xml:space="preserve">puntos casi quietos, los nodos (Figura 1).</w:t>
       </w:r>
     </w:p>
     <w:bookmarkEnd w:id="22"/>
@@ -413,9 +451,9 @@
       <w:r>
         <w:drawing>
           <wp:inline>
-            <wp:extent cx="1655999" cy="1765622"/>
+            <wp:extent cx="2519999" cy="2396687"/>
             <wp:effectExtent b="0" l="0" r="0" t="0"/>
-            <wp:docPr descr="Figura 1. Muelle entre el vibrador y un soporte fijo." title="" id="24" name="Picture"/>
+            <wp:docPr descr="Figura 1. Muelle entre el vibrador y un soporte fijo, oscilando en el modo n = 3." title="" id="24" name="Picture"/>
             <a:graphic>
               <a:graphicData uri="http://schemas.openxmlformats.org/drawingml/2006/picture">
                 <pic:pic>
@@ -434,7 +472,7 @@
                   <pic:spPr bwMode="auto">
                     <a:xfrm>
                       <a:off x="0" y="0"/>
-                      <a:ext cx="1655999" cy="1765622"/>
+                      <a:ext cx="2519999" cy="2396687"/>
                     </a:xfrm>
                     <a:prstGeom prst="rect">
                       <a:avLst/>
@@ -456,10 +494,25 @@
     <w:p>
       <w:pPr>
         <w:pStyle w:val="ImageCaption"/>
+        <w:spacing w:after="280"/>
         <w:jc w:val="center"/>
       </w:pPr>
       <w:r>
-        <w:t xml:space="preserve">Figura 1. Muelle entre el vibrador y un soporte fijo.</w:t>
+        <w:t xml:space="preserve">Figura 1. Muelle entre el vibrador y un soporte fijo, oscilando en el modo</w:t>
+      </w:r>
+      <w:r>
+        <w:t xml:space="preserve"> </w:t>
+      </w:r>
+      <m:oMath>
+        <m:r>
+          <m:t>n</m:t>
+        </m:r>
+      </m:oMath>
+      <w:r>
+        <w:t xml:space="preserve"> </w:t>
+      </w:r>
+      <w:r>
+        <w:t xml:space="preserve">= 3.</w:t>
       </w:r>
     </w:p>
     <w:p>
@@ -469,112 +522,7 @@
         <w:jc w:val="both"/>
       </w:pPr>
       <w:r>
-        <w:t xml:space="preserve">El muelle cuelga del vástago del vibrador mecánico y su extremo inferior se sujeta a un soporte fijo, de modo que quede estirado. El vibrador se conecta a la salida del generador de funciones (onda senoidal). La frecuencia se lee en el generador. Empezar con amplitud baja y subirla solo lo necesario para ver los modos.</w:t>
-      </w:r>
-    </w:p>
-    <w:bookmarkEnd w:id="26"/>
-    <w:bookmarkStart w:id="29" w:name="resultados"/>
-    <w:p>
-      <w:pPr>
-        <w:pStyle w:val="Heading2"/>
-        <w:numPr>
-          <w:ilvl w:val="0"/>
-          <w:numId w:val="0"/>
-        </w:numPr>
-        <w:spacing w:before="440" w:after="160"/>
-      </w:pPr>
-      <w:r>
-        <w:rPr>
-          <w:sz w:val="36"/>
-        </w:rPr>
-        <w:t xml:space="preserve">Resultados</w:t>
-      </w:r>
-    </w:p>
-    <w:bookmarkStart w:id="27" w:name="parte-a.-constante-y-masa-del-muelle"/>
-    <w:p>
-      <w:pPr>
-        <w:pStyle w:val="Heading3"/>
-        <w:numPr>
-          <w:ilvl w:val="0"/>
-          <w:numId w:val="0"/>
-        </w:numPr>
-        <w:spacing w:before="320" w:after="120"/>
-      </w:pPr>
-      <w:r>
-        <w:rPr>
-          <w:i w:val="0"/>
-          <w:sz w:val="26"/>
-        </w:rPr>
-        <w:t xml:space="preserve">Parte A. Constante y masa del muelle</w:t>
-      </w:r>
-    </w:p>
-    <w:p>
-      <w:pPr>
-        <w:pStyle w:val="FirstParagraph"/>
-        <w:spacing w:after="120" w:line="276" w:lineRule="auto"/>
-        <w:jc w:val="both"/>
-      </w:pPr>
-      <w:r>
-        <w:t xml:space="preserve">Medir la masa</w:t>
-      </w:r>
-      <w:r>
-        <w:t xml:space="preserve"> </w:t>
-      </w:r>
-      <m:oMath>
-        <m:r>
-          <m:t>M</m:t>
-        </m:r>
-      </m:oMath>
-      <w:r>
-        <w:t xml:space="preserve"> </w:t>
-      </w:r>
-      <w:r>
-        <w:t xml:space="preserve">del muelle con la balanza. Colgarlo de un soporte y medir su alargamiento con tres masas para obtener</w:t>
-      </w:r>
-      <w:r>
-        <w:t xml:space="preserve"> </w:t>
-      </w:r>
-      <m:oMath>
-        <m:r>
-          <m:t>k</m:t>
-        </m:r>
-      </m:oMath>
-      <w:r>
-        <w:t xml:space="preserve"> </w:t>
-      </w:r>
-      <w:r>
-        <w:t xml:space="preserve">(pendiente de</w:t>
-      </w:r>
-      <w:r>
-        <w:t xml:space="preserve"> </w:t>
-      </w:r>
-      <m:oMath>
-        <m:r>
-          <m:t>m</m:t>
-        </m:r>
-        <m:r>
-          <m:t>g</m:t>
-        </m:r>
-      </m:oMath>
-      <w:r>
-        <w:t xml:space="preserve"> </w:t>
-      </w:r>
-      <w:r>
-        <w:t xml:space="preserve">frente a</w:t>
-      </w:r>
-      <w:r>
-        <w:t xml:space="preserve"> </w:t>
-      </w:r>
-      <m:oMath>
-        <m:r>
-          <m:t>Δ</m:t>
-        </m:r>
-        <m:r>
-          <m:t>y</m:t>
-        </m:r>
-      </m:oMath>
-      <w:r>
-        <w:t xml:space="preserve">).</w:t>
+        <w:t xml:space="preserve">El muelle cuelga del vástago del vibrador mecánico y su extremo inferior se sujeta a un soporte fijo, de modo que quede estirado. El vibrador se conecta a la salida senoidal del generador de funciones, en el que se lee la frecuencia. Conviene empezar con la amplitud baja y subirla solo lo necesario para ver los modos.</w:t>
       </w:r>
     </w:p>
     <w:p>
@@ -583,27 +531,33 @@
         <w:spacing w:after="120" w:line="276" w:lineRule="auto"/>
         <w:jc w:val="both"/>
       </w:pPr>
+      <w:r>
+        <w:t xml:space="preserve">Antes de montarlo, medir la masa del muelle con la balanza. Una vez montado, medir su longitud</w:t>
+      </w:r>
+      <w:r>
+        <w:t xml:space="preserve"> </w:t>
+      </w:r>
       <m:oMath>
         <m:r>
-          <m:t>M</m:t>
+          <m:t>L</m:t>
         </m:r>
       </m:oMath>
       <w:r>
         <w:t xml:space="preserve"> </w:t>
       </w:r>
       <w:r>
-        <w:t xml:space="preserve">= __________</w:t>
+        <w:t xml:space="preserve">con la cinta métrica.</w:t>
       </w:r>
     </w:p>
     <w:p>
       <w:pPr>
         <w:pStyle w:val="TableCaption"/>
         <w:keepNext/>
-        <w:spacing w:before="200" w:after="80"/>
+        <w:spacing w:after="80" w:before="200"/>
         <w:jc w:val="center"/>
       </w:pPr>
       <w:r>
-        <w:t xml:space="preserve">Tabla 1. Medida estática de la constante del muelle.</w:t>
+        <w:t xml:space="preserve">Tabla 1. Masa y longitud del muelle.</w:t>
       </w:r>
     </w:p>
     <w:tbl>
@@ -619,12 +573,11 @@
           <w:insideV w:val="single" w:sz="6" w:color="000000"/>
         </w:tblBorders>
         <w:tblLook w:firstRow="1" w:lastRow="0" w:firstColumn="0" w:lastColumn="0" w:noHBand="0" w:noVBand="0" w:val="0020"/>
-        <w:tblCaption w:val="Tabla 1. Medida estática de la constante del muelle."/>
+        <w:tblCaption w:val="Tabla 1. Masa y longitud del muelle."/>
       </w:tblPr>
       <w:tblGrid>
-        <w:gridCol w:w="2640"/>
-        <w:gridCol w:w="2640"/>
-        <w:gridCol w:w="2640"/>
+        <w:gridCol w:w="3960"/>
+        <w:gridCol w:w="3960"/>
       </w:tblGrid>
       <w:tr>
         <w:trPr>
@@ -644,7 +597,7 @@
             </w:pPr>
             <m:oMath>
               <m:r>
-                <m:t>m</m:t>
+                <m:t>M</m:t>
               </m:r>
             </m:oMath>
             <w:r>
@@ -674,43 +627,7 @@
             </w:pPr>
             <m:oMath>
               <m:r>
-                <m:t>m</m:t>
-              </m:r>
-              <m:r>
-                <m:t>g</m:t>
-              </m:r>
-            </m:oMath>
-            <w:r>
-              <w:rPr>
-                <w:sz w:val="20"/>
-              </w:rPr>
-              <w:t xml:space="preserve"> </w:t>
-            </w:r>
-            <w:r>
-              <w:rPr>
-                <w:sz w:val="20"/>
-              </w:rPr>
-              <w:t xml:space="preserve">(N)</w:t>
-            </w:r>
-          </w:p>
-        </w:tc>
-        <w:tc>
-          <w:tcPr>
-            <w:shd w:val="clear" w:color="auto" w:fill="FFF0C1"/>
-            <w:vAlign w:val="center"/>
-          </w:tcPr>
-          <w:p>
-            <w:pPr>
-              <w:pStyle w:val="Compact"/>
-              <w:keepNext/>
-              <w:jc w:val="center"/>
-            </w:pPr>
-            <m:oMath>
-              <m:r>
-                <m:t>Δ</m:t>
-              </m:r>
-              <m:r>
-                <m:t>y</m:t>
+                <m:t>L</m:t>
               </m:r>
             </m:oMath>
             <w:r>
@@ -768,161 +685,24 @@
             </w:r>
           </w:p>
         </w:tc>
-        <w:tc>
-          <w:tcPr>
-            <w:vAlign w:val="center"/>
-          </w:tcPr>
-          <w:p>
-            <w:pPr>
-              <w:pStyle w:val="Compact"/>
-              <w:keepNext/>
-              <w:jc w:val="center"/>
-            </w:pPr>
-            <w:r>
-              <w:rPr>
-                <w:sz w:val="20"/>
-              </w:rPr>
-              <w:t xml:space="preserve"> </w:t>
-            </w:r>
-          </w:p>
-        </w:tc>
-      </w:tr>
-      <w:tr>
-        <w:trPr>
-          <w:trHeight w:val="425" w:hRule="atLeast"/>
-        </w:trPr>
-        <w:tc>
-          <w:tcPr>
-            <w:vAlign w:val="center"/>
-          </w:tcPr>
-          <w:p>
-            <w:pPr>
-              <w:pStyle w:val="Compact"/>
-              <w:keepNext/>
-              <w:jc w:val="center"/>
-            </w:pPr>
-            <w:r>
-              <w:rPr>
-                <w:sz w:val="20"/>
-              </w:rPr>
-              <w:t xml:space="preserve"> </w:t>
-            </w:r>
-          </w:p>
-        </w:tc>
-        <w:tc>
-          <w:tcPr>
-            <w:vAlign w:val="center"/>
-          </w:tcPr>
-          <w:p>
-            <w:pPr>
-              <w:pStyle w:val="Compact"/>
-              <w:keepNext/>
-              <w:jc w:val="center"/>
-            </w:pPr>
-            <w:r>
-              <w:rPr>
-                <w:sz w:val="20"/>
-              </w:rPr>
-              <w:t xml:space="preserve"> </w:t>
-            </w:r>
-          </w:p>
-        </w:tc>
-        <w:tc>
-          <w:tcPr>
-            <w:vAlign w:val="center"/>
-          </w:tcPr>
-          <w:p>
-            <w:pPr>
-              <w:pStyle w:val="Compact"/>
-              <w:keepNext/>
-              <w:jc w:val="center"/>
-            </w:pPr>
-            <w:r>
-              <w:rPr>
-                <w:sz w:val="20"/>
-              </w:rPr>
-              <w:t xml:space="preserve"> </w:t>
-            </w:r>
-          </w:p>
-        </w:tc>
-      </w:tr>
-      <w:tr>
-        <w:trPr>
-          <w:trHeight w:val="425" w:hRule="atLeast"/>
-        </w:trPr>
-        <w:tc>
-          <w:tcPr>
-            <w:vAlign w:val="center"/>
-          </w:tcPr>
-          <w:p>
-            <w:pPr>
-              <w:pStyle w:val="Compact"/>
-              <w:keepNext/>
-              <w:jc w:val="center"/>
-            </w:pPr>
-            <w:r>
-              <w:rPr>
-                <w:sz w:val="20"/>
-              </w:rPr>
-              <w:t xml:space="preserve"> </w:t>
-            </w:r>
-          </w:p>
-        </w:tc>
-        <w:tc>
-          <w:tcPr>
-            <w:vAlign w:val="center"/>
-          </w:tcPr>
-          <w:p>
-            <w:pPr>
-              <w:pStyle w:val="Compact"/>
-              <w:keepNext/>
-              <w:jc w:val="center"/>
-            </w:pPr>
-            <w:r>
-              <w:rPr>
-                <w:sz w:val="20"/>
-              </w:rPr>
-              <w:t xml:space="preserve"> </w:t>
-            </w:r>
-          </w:p>
-        </w:tc>
-        <w:tc>
-          <w:tcPr>
-            <w:vAlign w:val="center"/>
-          </w:tcPr>
-          <w:p>
-            <w:pPr>
-              <w:pStyle w:val="Compact"/>
-              <w:keepNext/>
-              <w:jc w:val="center"/>
-            </w:pPr>
-            <w:r>
-              <w:rPr>
-                <w:sz w:val="20"/>
-              </w:rPr>
-              <w:t xml:space="preserve"> </w:t>
-            </w:r>
-          </w:p>
-        </w:tc>
       </w:tr>
     </w:tbl>
-    <w:bookmarkEnd w:id="27"/>
-    <w:bookmarkStart w:id="28" w:name="parte-b.-modos-normales"/>
+    <w:bookmarkEnd w:id="26"/>
+    <w:bookmarkStart w:id="27" w:name="resultados"/>
     <w:p>
       <w:pPr>
-        <w:pStyle w:val="Heading3"/>
+        <w:pStyle w:val="Heading2"/>
         <w:numPr>
           <w:ilvl w:val="0"/>
           <w:numId w:val="0"/>
         </w:numPr>
-        <w:spacing w:before="320" w:after="120"/>
+        <w:spacing w:before="440" w:after="160"/>
       </w:pPr>
       <w:r>
         <w:rPr>
-          <w:i w:val="0"/>
-          <w:sz w:val="26"/>
+          <w:sz w:val="36"/>
         </w:rPr>
-        <w:t xml:space="preserve">Parte B. Modos normales</w:t>
+        <w:t xml:space="preserve">Resultados</w:t>
       </w:r>
     </w:p>
     <w:p>
@@ -932,18 +712,7 @@
         <w:jc w:val="both"/>
       </w:pPr>
       <w:r>
-        <w:t xml:space="preserve">Montar el muelle en el vibrador y medir su longitud</w:t>
-      </w:r>
-      <w:r>
-        <w:t xml:space="preserve"> </w:t>
-      </w:r>
-      <m:oMath>
-        <m:r>
-          <m:t>L</m:t>
-        </m:r>
-      </m:oMath>
-      <w:r>
-        <w:t xml:space="preserve">. Subir la frecuencia lentamente desde 1 Hz y, para cada modo, ajustar la frecuencia hasta que la amplitud de los vientres sea máxima y anotar</w:t>
+        <w:t xml:space="preserve">Subir la frecuencia despacio desde 1 Hz. Cuando aparezca un modo, ajustar la frecuencia hasta que los vientres tengan la máxima amplitud, contar los vientres para saber qué modo es y anotar la frecuencia</w:t>
       </w:r>
       <w:r>
         <w:t xml:space="preserve"> </w:t>
@@ -963,10 +732,7 @@
         </m:sSub>
       </m:oMath>
       <w:r>
-        <w:t xml:space="preserve"> </w:t>
-      </w:r>
-      <w:r>
-        <w:t xml:space="preserve">y el número de vientres. Medir hasta</w:t>
+        <w:t xml:space="preserve">. Seguir subiendo hasta el modo</w:t>
       </w:r>
       <w:r>
         <w:t xml:space="preserve"> </w:t>
@@ -975,21 +741,12 @@
         <m:r>
           <m:t>n</m:t>
         </m:r>
-        <m:r>
-          <m:rPr>
-            <m:sty m:val="p"/>
-          </m:rPr>
-          <m:t>=</m:t>
-        </m:r>
-        <m:r>
-          <m:t>6</m:t>
-        </m:r>
       </m:oMath>
       <w:r>
         <w:t xml:space="preserve"> </w:t>
       </w:r>
       <w:r>
-        <w:t xml:space="preserve">o hasta donde se distingan. Repetir para una segunda longitud del muelle.</w:t>
+        <w:t xml:space="preserve">= 6, o hasta donde se distingan.</w:t>
       </w:r>
     </w:p>
     <w:p>
@@ -998,58 +755,35 @@
         <w:spacing w:after="120" w:line="276" w:lineRule="auto"/>
         <w:jc w:val="both"/>
       </w:pPr>
+      <w:r>
+        <w:t xml:space="preserve">Para el error de</w:t>
+      </w:r>
+      <w:r>
+        <w:t xml:space="preserve"> </w:t>
+      </w:r>
       <m:oMath>
         <m:sSub>
           <m:e>
             <m:r>
-              <m:t>L</m:t>
+              <m:t>f</m:t>
             </m:r>
           </m:e>
           <m:sub>
             <m:r>
-              <m:t>1</m:t>
+              <m:t>n</m:t>
             </m:r>
           </m:sub>
         </m:sSub>
       </m:oMath>
       <w:r>
-        <w:t xml:space="preserve"> </w:t>
-      </w:r>
-      <w:r>
-        <w:t xml:space="preserve">= __________</w:t>
-      </w:r>
-      <w:r>
-        <w:t xml:space="preserve"> </w:t>
-      </w:r>
-      <m:oMath>
-        <m:r>
-          <m:t>  </m:t>
-        </m:r>
-        <m:sSub>
-          <m:e>
-            <m:r>
-              <m:t>L</m:t>
-            </m:r>
-          </m:e>
-          <m:sub>
-            <m:r>
-              <m:t>2</m:t>
-            </m:r>
-          </m:sub>
-        </m:sSub>
-      </m:oMath>
-      <w:r>
-        <w:t xml:space="preserve"> </w:t>
-      </w:r>
-      <w:r>
-        <w:t xml:space="preserve">= __________</w:t>
+        <w:t xml:space="preserve">, anotar también la frecuencia más baja y la más alta entre las que la amplitud se ve máxima. El error es la mitad de la diferencia entre ambas.</w:t>
       </w:r>
     </w:p>
     <w:p>
       <w:pPr>
         <w:pStyle w:val="TableCaption"/>
         <w:keepNext/>
-        <w:spacing w:before="200" w:after="80"/>
+        <w:spacing w:after="80" w:before="200"/>
         <w:jc w:val="center"/>
       </w:pPr>
       <w:r>
@@ -1072,11 +806,9 @@
         <w:tblCaption w:val="Tabla 2. Frecuencias de los modos normales."/>
       </w:tblPr>
       <w:tblGrid>
-        <w:gridCol w:w="1584"/>
-        <w:gridCol w:w="1584"/>
-        <w:gridCol w:w="1584"/>
-        <w:gridCol w:w="1584"/>
-        <w:gridCol w:w="1584"/>
+        <w:gridCol w:w="2640"/>
+        <w:gridCol w:w="2640"/>
+        <w:gridCol w:w="2640"/>
       </w:tblGrid>
       <w:tr>
         <w:trPr>
@@ -1091,6 +823,7 @@
           <w:p>
             <w:pPr>
               <w:pStyle w:val="Compact"/>
+              <w:keepNext/>
               <w:jc w:val="center"/>
             </w:pPr>
             <m:oMath>
@@ -1108,6 +841,7 @@
           <w:p>
             <w:pPr>
               <w:pStyle w:val="Compact"/>
+              <w:keepNext/>
               <w:jc w:val="center"/>
             </w:pPr>
             <m:oMath>
@@ -1134,28 +868,8 @@
               <w:rPr>
                 <w:sz w:val="20"/>
               </w:rPr>
-              <w:t xml:space="preserve">(Hz),</w:t>
-            </w:r>
-            <w:r>
-              <w:rPr>
-                <w:sz w:val="20"/>
-              </w:rPr>
-              <w:t xml:space="preserve"> </w:t>
-            </w:r>
-            <m:oMath>
-              <m:sSub>
-                <m:e>
-                  <m:r>
-                    <m:t>L</m:t>
-                  </m:r>
-                </m:e>
-                <m:sub>
-                  <m:r>
-                    <m:t>1</m:t>
-                  </m:r>
-                </m:sub>
-              </m:sSub>
-            </m:oMath>
+              <w:t xml:space="preserve">(Hz)</w:t>
+            </w:r>
           </w:p>
         </w:tc>
         <w:tc>
@@ -1166,6 +880,7 @@
           <w:p>
             <w:pPr>
               <w:pStyle w:val="Compact"/>
+              <w:keepNext/>
               <w:jc w:val="center"/>
             </w:pPr>
             <m:oMath>
@@ -1176,105 +891,18 @@
                   </m:r>
                 </m:e>
                 <m:sub>
-                  <m:r>
-                    <m:t>f</m:t>
-                  </m:r>
-                </m:sub>
-              </m:sSub>
-            </m:oMath>
-            <w:r>
-              <w:rPr>
-                <w:sz w:val="20"/>
-              </w:rPr>
-              <w:t xml:space="preserve"> </w:t>
-            </w:r>
-            <w:r>
-              <w:rPr>
-                <w:sz w:val="20"/>
-              </w:rPr>
-              <w:t xml:space="preserve">(Hz)</w:t>
-            </w:r>
-          </w:p>
-        </w:tc>
-        <w:tc>
-          <w:tcPr>
-            <w:shd w:val="clear" w:color="auto" w:fill="FFF0C1"/>
-            <w:vAlign w:val="center"/>
-          </w:tcPr>
-          <w:p>
-            <w:pPr>
-              <w:pStyle w:val="Compact"/>
-              <w:jc w:val="center"/>
-            </w:pPr>
-            <m:oMath>
-              <m:sSub>
-                <m:e>
-                  <m:r>
-                    <m:t>f</m:t>
-                  </m:r>
-                </m:e>
-                <m:sub>
-                  <m:r>
-                    <m:t>n</m:t>
-                  </m:r>
-                </m:sub>
-              </m:sSub>
-            </m:oMath>
-            <w:r>
-              <w:rPr>
-                <w:sz w:val="20"/>
-              </w:rPr>
-              <w:t xml:space="preserve"> </w:t>
-            </w:r>
-            <w:r>
-              <w:rPr>
-                <w:sz w:val="20"/>
-              </w:rPr>
-              <w:t xml:space="preserve">(Hz),</w:t>
-            </w:r>
-            <w:r>
-              <w:rPr>
-                <w:sz w:val="20"/>
-              </w:rPr>
-              <w:t xml:space="preserve"> </w:t>
-            </w:r>
-            <m:oMath>
-              <m:sSub>
-                <m:e>
-                  <m:r>
-                    <m:t>L</m:t>
-                  </m:r>
-                </m:e>
-                <m:sub>
-                  <m:r>
-                    <m:t>2</m:t>
-                  </m:r>
-                </m:sub>
-              </m:sSub>
-            </m:oMath>
-          </w:p>
-        </w:tc>
-        <w:tc>
-          <w:tcPr>
-            <w:shd w:val="clear" w:color="auto" w:fill="FFF0C1"/>
-            <w:vAlign w:val="center"/>
-          </w:tcPr>
-          <w:p>
-            <w:pPr>
-              <w:pStyle w:val="Compact"/>
-              <w:jc w:val="center"/>
-            </w:pPr>
-            <m:oMath>
-              <m:sSub>
-                <m:e>
-                  <m:r>
-                    <m:t>ε</m:t>
-                  </m:r>
-                </m:e>
-                <m:sub>
-                  <m:r>
-                    <m:t>f</m:t>
-                  </m:r>
+                  <m:sSub>
+                    <m:e>
+                      <m:r>
+                        <m:t>f</m:t>
+                      </m:r>
+                    </m:e>
+                    <m:sub>
+                      <m:r>
+                        <m:t>n</m:t>
+                      </m:r>
+                    </m:sub>
+                  </m:sSub>
                 </m:sub>
               </m:sSub>
             </m:oMath>
@@ -1304,6 +932,25 @@
           <w:p>
             <w:pPr>
               <w:pStyle w:val="Compact"/>
+              <w:keepNext/>
+              <w:jc w:val="center"/>
+            </w:pPr>
+            <w:r>
+              <w:rPr>
+                <w:sz w:val="20"/>
+              </w:rPr>
+              <w:t xml:space="preserve">1</w:t>
+            </w:r>
+          </w:p>
+        </w:tc>
+        <w:tc>
+          <w:tcPr>
+            <w:vAlign w:val="center"/>
+          </w:tcPr>
+          <w:p>
+            <w:pPr>
+              <w:pStyle w:val="Compact"/>
+              <w:keepNext/>
               <w:jc w:val="center"/>
             </w:pPr>
             <w:r>
@@ -1321,57 +968,7 @@
           <w:p>
             <w:pPr>
               <w:pStyle w:val="Compact"/>
-              <w:jc w:val="center"/>
-            </w:pPr>
-            <w:r>
-              <w:rPr>
-                <w:sz w:val="20"/>
-              </w:rPr>
-              <w:t xml:space="preserve"> </w:t>
-            </w:r>
-          </w:p>
-        </w:tc>
-        <w:tc>
-          <w:tcPr>
-            <w:vAlign w:val="center"/>
-          </w:tcPr>
-          <w:p>
-            <w:pPr>
-              <w:pStyle w:val="Compact"/>
-              <w:jc w:val="center"/>
-            </w:pPr>
-            <w:r>
-              <w:rPr>
-                <w:sz w:val="20"/>
-              </w:rPr>
-              <w:t xml:space="preserve"> </w:t>
-            </w:r>
-          </w:p>
-        </w:tc>
-        <w:tc>
-          <w:tcPr>
-            <w:vAlign w:val="center"/>
-          </w:tcPr>
-          <w:p>
-            <w:pPr>
-              <w:pStyle w:val="Compact"/>
-              <w:jc w:val="center"/>
-            </w:pPr>
-            <w:r>
-              <w:rPr>
-                <w:sz w:val="20"/>
-              </w:rPr>
-              <w:t xml:space="preserve"> </w:t>
-            </w:r>
-          </w:p>
-        </w:tc>
-        <w:tc>
-          <w:tcPr>
-            <w:vAlign w:val="center"/>
-          </w:tcPr>
-          <w:p>
-            <w:pPr>
-              <w:pStyle w:val="Compact"/>
+              <w:keepNext/>
               <w:jc w:val="center"/>
             </w:pPr>
             <w:r>
@@ -1394,6 +991,25 @@
           <w:p>
             <w:pPr>
               <w:pStyle w:val="Compact"/>
+              <w:keepNext/>
+              <w:jc w:val="center"/>
+            </w:pPr>
+            <w:r>
+              <w:rPr>
+                <w:sz w:val="20"/>
+              </w:rPr>
+              <w:t xml:space="preserve">2</w:t>
+            </w:r>
+          </w:p>
+        </w:tc>
+        <w:tc>
+          <w:tcPr>
+            <w:vAlign w:val="center"/>
+          </w:tcPr>
+          <w:p>
+            <w:pPr>
+              <w:pStyle w:val="Compact"/>
+              <w:keepNext/>
               <w:jc w:val="center"/>
             </w:pPr>
             <w:r>
@@ -1411,57 +1027,7 @@
           <w:p>
             <w:pPr>
               <w:pStyle w:val="Compact"/>
-              <w:jc w:val="center"/>
-            </w:pPr>
-            <w:r>
-              <w:rPr>
-                <w:sz w:val="20"/>
-              </w:rPr>
-              <w:t xml:space="preserve"> </w:t>
-            </w:r>
-          </w:p>
-        </w:tc>
-        <w:tc>
-          <w:tcPr>
-            <w:vAlign w:val="center"/>
-          </w:tcPr>
-          <w:p>
-            <w:pPr>
-              <w:pStyle w:val="Compact"/>
-              <w:jc w:val="center"/>
-            </w:pPr>
-            <w:r>
-              <w:rPr>
-                <w:sz w:val="20"/>
-              </w:rPr>
-              <w:t xml:space="preserve"> </w:t>
-            </w:r>
-          </w:p>
-        </w:tc>
-        <w:tc>
-          <w:tcPr>
-            <w:vAlign w:val="center"/>
-          </w:tcPr>
-          <w:p>
-            <w:pPr>
-              <w:pStyle w:val="Compact"/>
-              <w:jc w:val="center"/>
-            </w:pPr>
-            <w:r>
-              <w:rPr>
-                <w:sz w:val="20"/>
-              </w:rPr>
-              <w:t xml:space="preserve"> </w:t>
-            </w:r>
-          </w:p>
-        </w:tc>
-        <w:tc>
-          <w:tcPr>
-            <w:vAlign w:val="center"/>
-          </w:tcPr>
-          <w:p>
-            <w:pPr>
-              <w:pStyle w:val="Compact"/>
+              <w:keepNext/>
               <w:jc w:val="center"/>
             </w:pPr>
             <w:r>
@@ -1484,6 +1050,25 @@
           <w:p>
             <w:pPr>
               <w:pStyle w:val="Compact"/>
+              <w:keepNext/>
+              <w:jc w:val="center"/>
+            </w:pPr>
+            <w:r>
+              <w:rPr>
+                <w:sz w:val="20"/>
+              </w:rPr>
+              <w:t xml:space="preserve">3</w:t>
+            </w:r>
+          </w:p>
+        </w:tc>
+        <w:tc>
+          <w:tcPr>
+            <w:vAlign w:val="center"/>
+          </w:tcPr>
+          <w:p>
+            <w:pPr>
+              <w:pStyle w:val="Compact"/>
+              <w:keepNext/>
               <w:jc w:val="center"/>
             </w:pPr>
             <w:r>
@@ -1501,57 +1086,7 @@
           <w:p>
             <w:pPr>
               <w:pStyle w:val="Compact"/>
-              <w:jc w:val="center"/>
-            </w:pPr>
-            <w:r>
-              <w:rPr>
-                <w:sz w:val="20"/>
-              </w:rPr>
-              <w:t xml:space="preserve"> </w:t>
-            </w:r>
-          </w:p>
-        </w:tc>
-        <w:tc>
-          <w:tcPr>
-            <w:vAlign w:val="center"/>
-          </w:tcPr>
-          <w:p>
-            <w:pPr>
-              <w:pStyle w:val="Compact"/>
-              <w:jc w:val="center"/>
-            </w:pPr>
-            <w:r>
-              <w:rPr>
-                <w:sz w:val="20"/>
-              </w:rPr>
-              <w:t xml:space="preserve"> </w:t>
-            </w:r>
-          </w:p>
-        </w:tc>
-        <w:tc>
-          <w:tcPr>
-            <w:vAlign w:val="center"/>
-          </w:tcPr>
-          <w:p>
-            <w:pPr>
-              <w:pStyle w:val="Compact"/>
-              <w:jc w:val="center"/>
-            </w:pPr>
-            <w:r>
-              <w:rPr>
-                <w:sz w:val="20"/>
-              </w:rPr>
-              <w:t xml:space="preserve"> </w:t>
-            </w:r>
-          </w:p>
-        </w:tc>
-        <w:tc>
-          <w:tcPr>
-            <w:vAlign w:val="center"/>
-          </w:tcPr>
-          <w:p>
-            <w:pPr>
-              <w:pStyle w:val="Compact"/>
+              <w:keepNext/>
               <w:jc w:val="center"/>
             </w:pPr>
             <w:r>
@@ -1574,6 +1109,25 @@
           <w:p>
             <w:pPr>
               <w:pStyle w:val="Compact"/>
+              <w:keepNext/>
+              <w:jc w:val="center"/>
+            </w:pPr>
+            <w:r>
+              <w:rPr>
+                <w:sz w:val="20"/>
+              </w:rPr>
+              <w:t xml:space="preserve">4</w:t>
+            </w:r>
+          </w:p>
+        </w:tc>
+        <w:tc>
+          <w:tcPr>
+            <w:vAlign w:val="center"/>
+          </w:tcPr>
+          <w:p>
+            <w:pPr>
+              <w:pStyle w:val="Compact"/>
+              <w:keepNext/>
               <w:jc w:val="center"/>
             </w:pPr>
             <w:r>
@@ -1591,57 +1145,7 @@
           <w:p>
             <w:pPr>
               <w:pStyle w:val="Compact"/>
-              <w:jc w:val="center"/>
-            </w:pPr>
-            <w:r>
-              <w:rPr>
-                <w:sz w:val="20"/>
-              </w:rPr>
-              <w:t xml:space="preserve"> </w:t>
-            </w:r>
-          </w:p>
-        </w:tc>
-        <w:tc>
-          <w:tcPr>
-            <w:vAlign w:val="center"/>
-          </w:tcPr>
-          <w:p>
-            <w:pPr>
-              <w:pStyle w:val="Compact"/>
-              <w:jc w:val="center"/>
-            </w:pPr>
-            <w:r>
-              <w:rPr>
-                <w:sz w:val="20"/>
-              </w:rPr>
-              <w:t xml:space="preserve"> </w:t>
-            </w:r>
-          </w:p>
-        </w:tc>
-        <w:tc>
-          <w:tcPr>
-            <w:vAlign w:val="center"/>
-          </w:tcPr>
-          <w:p>
-            <w:pPr>
-              <w:pStyle w:val="Compact"/>
-              <w:jc w:val="center"/>
-            </w:pPr>
-            <w:r>
-              <w:rPr>
-                <w:sz w:val="20"/>
-              </w:rPr>
-              <w:t xml:space="preserve"> </w:t>
-            </w:r>
-          </w:p>
-        </w:tc>
-        <w:tc>
-          <w:tcPr>
-            <w:vAlign w:val="center"/>
-          </w:tcPr>
-          <w:p>
-            <w:pPr>
-              <w:pStyle w:val="Compact"/>
+              <w:keepNext/>
               <w:jc w:val="center"/>
             </w:pPr>
             <w:r>
@@ -1664,6 +1168,25 @@
           <w:p>
             <w:pPr>
               <w:pStyle w:val="Compact"/>
+              <w:keepNext/>
+              <w:jc w:val="center"/>
+            </w:pPr>
+            <w:r>
+              <w:rPr>
+                <w:sz w:val="20"/>
+              </w:rPr>
+              <w:t xml:space="preserve">5</w:t>
+            </w:r>
+          </w:p>
+        </w:tc>
+        <w:tc>
+          <w:tcPr>
+            <w:vAlign w:val="center"/>
+          </w:tcPr>
+          <w:p>
+            <w:pPr>
+              <w:pStyle w:val="Compact"/>
+              <w:keepNext/>
               <w:jc w:val="center"/>
             </w:pPr>
             <w:r>
@@ -1681,57 +1204,7 @@
           <w:p>
             <w:pPr>
               <w:pStyle w:val="Compact"/>
-              <w:jc w:val="center"/>
-            </w:pPr>
-            <w:r>
-              <w:rPr>
-                <w:sz w:val="20"/>
-              </w:rPr>
-              <w:t xml:space="preserve"> </w:t>
-            </w:r>
-          </w:p>
-        </w:tc>
-        <w:tc>
-          <w:tcPr>
-            <w:vAlign w:val="center"/>
-          </w:tcPr>
-          <w:p>
-            <w:pPr>
-              <w:pStyle w:val="Compact"/>
-              <w:jc w:val="center"/>
-            </w:pPr>
-            <w:r>
-              <w:rPr>
-                <w:sz w:val="20"/>
-              </w:rPr>
-              <w:t xml:space="preserve"> </w:t>
-            </w:r>
-          </w:p>
-        </w:tc>
-        <w:tc>
-          <w:tcPr>
-            <w:vAlign w:val="center"/>
-          </w:tcPr>
-          <w:p>
-            <w:pPr>
-              <w:pStyle w:val="Compact"/>
-              <w:jc w:val="center"/>
-            </w:pPr>
-            <w:r>
-              <w:rPr>
-                <w:sz w:val="20"/>
-              </w:rPr>
-              <w:t xml:space="preserve"> </w:t>
-            </w:r>
-          </w:p>
-        </w:tc>
-        <w:tc>
-          <w:tcPr>
-            <w:vAlign w:val="center"/>
-          </w:tcPr>
-          <w:p>
-            <w:pPr>
-              <w:pStyle w:val="Compact"/>
+              <w:keepNext/>
               <w:jc w:val="center"/>
             </w:pPr>
             <w:r>
@@ -1754,6 +1227,25 @@
           <w:p>
             <w:pPr>
               <w:pStyle w:val="Compact"/>
+              <w:keepNext/>
+              <w:jc w:val="center"/>
+            </w:pPr>
+            <w:r>
+              <w:rPr>
+                <w:sz w:val="20"/>
+              </w:rPr>
+              <w:t xml:space="preserve">6</w:t>
+            </w:r>
+          </w:p>
+        </w:tc>
+        <w:tc>
+          <w:tcPr>
+            <w:vAlign w:val="center"/>
+          </w:tcPr>
+          <w:p>
+            <w:pPr>
+              <w:pStyle w:val="Compact"/>
+              <w:keepNext/>
               <w:jc w:val="center"/>
             </w:pPr>
             <w:r>
@@ -1771,57 +1263,7 @@
           <w:p>
             <w:pPr>
               <w:pStyle w:val="Compact"/>
-              <w:jc w:val="center"/>
-            </w:pPr>
-            <w:r>
-              <w:rPr>
-                <w:sz w:val="20"/>
-              </w:rPr>
-              <w:t xml:space="preserve"> </w:t>
-            </w:r>
-          </w:p>
-        </w:tc>
-        <w:tc>
-          <w:tcPr>
-            <w:vAlign w:val="center"/>
-          </w:tcPr>
-          <w:p>
-            <w:pPr>
-              <w:pStyle w:val="Compact"/>
-              <w:jc w:val="center"/>
-            </w:pPr>
-            <w:r>
-              <w:rPr>
-                <w:sz w:val="20"/>
-              </w:rPr>
-              <w:t xml:space="preserve"> </w:t>
-            </w:r>
-          </w:p>
-        </w:tc>
-        <w:tc>
-          <w:tcPr>
-            <w:vAlign w:val="center"/>
-          </w:tcPr>
-          <w:p>
-            <w:pPr>
-              <w:pStyle w:val="Compact"/>
-              <w:jc w:val="center"/>
-            </w:pPr>
-            <w:r>
-              <w:rPr>
-                <w:sz w:val="20"/>
-              </w:rPr>
-              <w:t xml:space="preserve"> </w:t>
-            </w:r>
-          </w:p>
-        </w:tc>
-        <w:tc>
-          <w:tcPr>
-            <w:vAlign w:val="center"/>
-          </w:tcPr>
-          <w:p>
-            <w:pPr>
-              <w:pStyle w:val="Compact"/>
+              <w:keepNext/>
               <w:jc w:val="center"/>
             </w:pPr>
             <w:r>
@@ -1834,9 +1276,8 @@
         </w:tc>
       </w:tr>
     </w:tbl>
-    <w:bookmarkEnd w:id="28"/>
-    <w:bookmarkEnd w:id="29"/>
-    <w:bookmarkStart w:id="30" w:name="cuestiones"/>
+    <w:bookmarkEnd w:id="27"/>
+    <w:bookmarkStart w:id="28" w:name="cuestiones"/>
     <w:p>
       <w:pPr>
         <w:pStyle w:val="Heading2"/>
@@ -1870,59 +1311,7 @@
         <w:t xml:space="preserve"> </w:t>
       </w:r>
       <w:r>
-        <w:t xml:space="preserve">Calcule</w:t>
-      </w:r>
-      <w:r>
-        <w:t xml:space="preserve"> </w:t>
-      </w:r>
-      <m:oMath>
-        <m:r>
-          <m:t>k</m:t>
-        </m:r>
-      </m:oMath>
-      <w:r>
-        <w:t xml:space="preserve"> </w:t>
-      </w:r>
-      <w:r>
-        <w:t xml:space="preserve">con su error a partir de la Tabla 1.</w:t>
-      </w:r>
-    </w:p>
-    <w:p>
-      <w:pPr>
-        <w:pStyle w:val="BodyText"/>
-        <w:spacing w:after="120" w:line="276" w:lineRule="auto"/>
-        <w:jc w:val="both"/>
-      </w:pPr>
-      <m:oMath>
-        <m:r>
-          <m:t>k</m:t>
-        </m:r>
-      </m:oMath>
-      <w:r>
-        <w:t xml:space="preserve"> </w:t>
-      </w:r>
-      <w:r>
-        <w:t xml:space="preserve">= ( __________ ± __________ ) N/m</w:t>
-      </w:r>
-    </w:p>
-    <w:p>
-      <w:pPr>
-        <w:pStyle w:val="BodyText"/>
-        <w:spacing w:before="280" w:after="120" w:line="276" w:lineRule="auto"/>
-        <w:jc w:val="both"/>
-      </w:pPr>
-      <w:r>
-        <w:rPr>
-          <w:bCs/>
-          <w:b/>
-        </w:rPr>
-        <w:t xml:space="preserve">2.</w:t>
-      </w:r>
-      <w:r>
-        <w:t xml:space="preserve"> </w:t>
-      </w:r>
-      <w:r>
-        <w:t xml:space="preserve">Inserte en una misma gráfica</w:t>
+        <w:t xml:space="preserve">Represente</w:t>
       </w:r>
       <w:r>
         <w:t xml:space="preserve"> </w:t>
@@ -1959,7 +1348,51 @@
         <w:t xml:space="preserve"> </w:t>
       </w:r>
       <w:r>
-        <w:t xml:space="preserve">para las dos longitudes, con sus rectas de ajuste, y obtenga las pendientes con sus errores.</w:t>
+        <w:t xml:space="preserve">con sus barras de error y la recta de ajuste por mínimos cuadrados,</w:t>
+      </w:r>
+      <w:r>
+        <w:t xml:space="preserve"> </w:t>
+      </w:r>
+      <m:oMath>
+        <m:sSub>
+          <m:e>
+            <m:r>
+              <m:t>f</m:t>
+            </m:r>
+          </m:e>
+          <m:sub>
+            <m:r>
+              <m:t>n</m:t>
+            </m:r>
+          </m:sub>
+        </m:sSub>
+        <m:r>
+          <m:rPr>
+            <m:sty m:val="p"/>
+          </m:rPr>
+          <m:t>=</m:t>
+        </m:r>
+        <m:r>
+          <m:t>B</m:t>
+        </m:r>
+        <m:r>
+          <m:t> </m:t>
+        </m:r>
+        <m:r>
+          <m:t>n</m:t>
+        </m:r>
+        <m:r>
+          <m:rPr>
+            <m:sty m:val="p"/>
+          </m:rPr>
+          <m:t>+</m:t>
+        </m:r>
+        <m:r>
+          <m:t>A</m:t>
+        </m:r>
+      </m:oMath>
+      <w:r>
+        <w:t xml:space="preserve">.</w:t>
       </w:r>
     </w:p>
     <w:tbl>
@@ -2004,9 +1437,66 @@
       </w:tr>
     </w:tbl>
     <w:p/>
+    <w:p>
+      <w:pPr>
+        <w:pStyle w:val="BodyText"/>
+        <w:spacing w:before="280" w:after="120" w:line="276" w:lineRule="auto"/>
+        <w:jc w:val="both"/>
+      </w:pPr>
+      <w:r>
+        <w:rPr>
+          <w:bCs/>
+          <w:b/>
+        </w:rPr>
+        <w:t xml:space="preserve">2.</w:t>
+      </w:r>
+      <w:r>
+        <w:t xml:space="preserve"> </w:t>
+      </w:r>
+      <w:r>
+        <w:t xml:space="preserve">A partir del ajuste, obtenga la velocidad de propagación</w:t>
+      </w:r>
+      <w:r>
+        <w:t xml:space="preserve"> </w:t>
+      </w:r>
+      <m:oMath>
+        <m:r>
+          <m:t>v</m:t>
+        </m:r>
+      </m:oMath>
+      <w:r>
+        <w:t xml:space="preserve"> </w:t>
+      </w:r>
+      <w:r>
+        <w:t xml:space="preserve">y la constante del muelle</w:t>
+      </w:r>
+      <w:r>
+        <w:t xml:space="preserve"> </w:t>
+      </w:r>
+      <m:oMath>
+        <m:r>
+          <m:t>k</m:t>
+        </m:r>
+      </m:oMath>
+      <w:r>
+        <w:t xml:space="preserve">, con sus errores.</w:t>
+      </w:r>
+    </w:p>
+    <w:p>
+      <w:pPr>
+        <w:pStyle w:val="TableCaption"/>
+        <w:keepNext/>
+        <w:spacing w:after="80" w:before="200"/>
+        <w:jc w:val="center"/>
+      </w:pPr>
+      <w:r>
+        <w:t xml:space="preserve">Tabla 3. Ajuste lineal, velocidad de propagación y constante del muelle.</w:t>
+      </w:r>
+    </w:p>
     <w:tbl>
       <w:tblPr>
         <w:tblW w:type="pct" w:w="5000"/>
+        <w:jc w:val="center"/>
         <w:tblBorders>
           <w:top w:val="single" w:sz="6" w:color="000000"/>
           <w:left w:val="single" w:sz="6" w:color="000000"/>
@@ -2015,265 +1505,373 @@
           <w:insideH w:val="single" w:sz="6" w:color="000000"/>
           <w:insideV w:val="single" w:sz="6" w:color="000000"/>
         </w:tblBorders>
-        <w:tblLook w:firstColumn="1" w:firstRow="1" w:lastColumn="0" w:lastRow="0" w:noHBand="0" w:noVBand="1" w:val="04A0"/>
+        <w:tblLook w:firstRow="1" w:lastRow="0" w:firstColumn="0" w:lastColumn="0" w:noHBand="0" w:noVBand="0" w:val="0020"/>
+        <w:tblCaption w:val="Tabla 3. Ajuste lineal, velocidad de propagación y constante del muelle."/>
       </w:tblPr>
       <w:tblGrid>
-        <w:gridCol w:w="9524"/>
+        <w:gridCol w:w="1131"/>
+        <w:gridCol w:w="1131"/>
+        <w:gridCol w:w="1131"/>
+        <w:gridCol w:w="1131"/>
+        <w:gridCol w:w="1131"/>
+        <w:gridCol w:w="1131"/>
+        <w:gridCol w:w="1131"/>
       </w:tblGrid>
       <w:tr>
         <w:trPr>
-          <w:trHeight w:val="1134" w:hRule="atLeast"/>
+          <w:trHeight w:val="510" w:hRule="atLeast"/>
+          <w:tblHeader w:val="true"/>
         </w:trPr>
         <w:tc>
           <w:tcPr>
-            <w:tcW w:type="dxa" w:w="9524"/>
-          </w:tcPr>
-          <w:p/>
+            <w:shd w:val="clear" w:color="auto" w:fill="FFF0C1"/>
+            <w:vAlign w:val="center"/>
+          </w:tcPr>
+          <w:p>
+            <w:pPr>
+              <w:pStyle w:val="Compact"/>
+              <w:keepNext/>
+              <w:jc w:val="center"/>
+            </w:pPr>
+            <m:oMath>
+              <m:r>
+                <m:t>B</m:t>
+              </m:r>
+            </m:oMath>
+            <w:r>
+              <w:rPr>
+                <w:sz w:val="20"/>
+              </w:rPr>
+              <w:t xml:space="preserve"> </w:t>
+            </w:r>
+            <w:r>
+              <w:rPr>
+                <w:sz w:val="20"/>
+              </w:rPr>
+              <w:t xml:space="preserve">(Hz)</w:t>
+            </w:r>
+          </w:p>
+        </w:tc>
+        <w:tc>
+          <w:tcPr>
+            <w:shd w:val="clear" w:color="auto" w:fill="FFF0C1"/>
+            <w:vAlign w:val="center"/>
+          </w:tcPr>
+          <w:p>
+            <w:pPr>
+              <w:pStyle w:val="Compact"/>
+              <w:keepNext/>
+              <w:jc w:val="center"/>
+            </w:pPr>
+            <m:oMath>
+              <m:r>
+                <m:t>A</m:t>
+              </m:r>
+            </m:oMath>
+            <w:r>
+              <w:rPr>
+                <w:sz w:val="20"/>
+              </w:rPr>
+              <w:t xml:space="preserve"> </w:t>
+            </w:r>
+            <w:r>
+              <w:rPr>
+                <w:sz w:val="20"/>
+              </w:rPr>
+              <w:t xml:space="preserve">(Hz)</w:t>
+            </w:r>
+          </w:p>
+        </w:tc>
+        <w:tc>
+          <w:tcPr>
+            <w:shd w:val="clear" w:color="auto" w:fill="FFF0C1"/>
+            <w:vAlign w:val="center"/>
+          </w:tcPr>
+          <w:p>
+            <w:pPr>
+              <w:pStyle w:val="Compact"/>
+              <w:keepNext/>
+              <w:jc w:val="center"/>
+            </w:pPr>
+            <m:oMath>
+              <m:r>
+                <m:t>r</m:t>
+              </m:r>
+            </m:oMath>
+          </w:p>
+        </w:tc>
+        <w:tc>
+          <w:tcPr>
+            <w:shd w:val="clear" w:color="auto" w:fill="FFF0C1"/>
+            <w:vAlign w:val="center"/>
+          </w:tcPr>
+          <w:p>
+            <w:pPr>
+              <w:pStyle w:val="Compact"/>
+              <w:keepNext/>
+              <w:jc w:val="center"/>
+            </w:pPr>
+            <m:oMath>
+              <m:r>
+                <m:t>v</m:t>
+              </m:r>
+            </m:oMath>
+            <w:r>
+              <w:rPr>
+                <w:sz w:val="20"/>
+              </w:rPr>
+              <w:t xml:space="preserve"> </w:t>
+            </w:r>
+            <w:r>
+              <w:rPr>
+                <w:sz w:val="20"/>
+              </w:rPr>
+              <w:t xml:space="preserve">(m/s)</w:t>
+            </w:r>
+          </w:p>
+        </w:tc>
+        <w:tc>
+          <w:tcPr>
+            <w:shd w:val="clear" w:color="auto" w:fill="FFF0C1"/>
+            <w:vAlign w:val="center"/>
+          </w:tcPr>
+          <w:p>
+            <w:pPr>
+              <w:pStyle w:val="Compact"/>
+              <w:keepNext/>
+              <w:jc w:val="center"/>
+            </w:pPr>
+            <m:oMath>
+              <m:sSub>
+                <m:e>
+                  <m:r>
+                    <m:t>ε</m:t>
+                  </m:r>
+                </m:e>
+                <m:sub>
+                  <m:r>
+                    <m:t>v</m:t>
+                  </m:r>
+                </m:sub>
+              </m:sSub>
+            </m:oMath>
+            <w:r>
+              <w:rPr>
+                <w:sz w:val="20"/>
+              </w:rPr>
+              <w:t xml:space="preserve"> </w:t>
+            </w:r>
+            <w:r>
+              <w:rPr>
+                <w:sz w:val="20"/>
+              </w:rPr>
+              <w:t xml:space="preserve">(m/s)</w:t>
+            </w:r>
+          </w:p>
+        </w:tc>
+        <w:tc>
+          <w:tcPr>
+            <w:shd w:val="clear" w:color="auto" w:fill="FFF0C1"/>
+            <w:vAlign w:val="center"/>
+          </w:tcPr>
+          <w:p>
+            <w:pPr>
+              <w:pStyle w:val="Compact"/>
+              <w:keepNext/>
+              <w:jc w:val="center"/>
+            </w:pPr>
+            <m:oMath>
+              <m:r>
+                <m:t>k</m:t>
+              </m:r>
+            </m:oMath>
+            <w:r>
+              <w:rPr>
+                <w:sz w:val="20"/>
+              </w:rPr>
+              <w:t xml:space="preserve"> </w:t>
+            </w:r>
+            <w:r>
+              <w:rPr>
+                <w:sz w:val="20"/>
+              </w:rPr>
+              <w:t xml:space="preserve">(N/m)</w:t>
+            </w:r>
+          </w:p>
+        </w:tc>
+        <w:tc>
+          <w:tcPr>
+            <w:shd w:val="clear" w:color="auto" w:fill="FFF0C1"/>
+            <w:vAlign w:val="center"/>
+          </w:tcPr>
+          <w:p>
+            <w:pPr>
+              <w:pStyle w:val="Compact"/>
+              <w:keepNext/>
+              <w:jc w:val="center"/>
+            </w:pPr>
+            <m:oMath>
+              <m:sSub>
+                <m:e>
+                  <m:r>
+                    <m:t>ε</m:t>
+                  </m:r>
+                </m:e>
+                <m:sub>
+                  <m:r>
+                    <m:t>k</m:t>
+                  </m:r>
+                </m:sub>
+              </m:sSub>
+            </m:oMath>
+            <w:r>
+              <w:rPr>
+                <w:sz w:val="20"/>
+              </w:rPr>
+              <w:t xml:space="preserve"> </w:t>
+            </w:r>
+            <w:r>
+              <w:rPr>
+                <w:sz w:val="20"/>
+              </w:rPr>
+              <w:t xml:space="preserve">(N/m)</w:t>
+            </w:r>
+          </w:p>
+        </w:tc>
+      </w:tr>
+      <w:tr>
+        <w:trPr>
+          <w:trHeight w:val="425" w:hRule="atLeast"/>
+        </w:trPr>
+        <w:tc>
+          <w:tcPr>
+            <w:vAlign w:val="center"/>
+          </w:tcPr>
+          <w:p>
+            <w:pPr>
+              <w:pStyle w:val="Compact"/>
+              <w:keepNext/>
+              <w:jc w:val="center"/>
+            </w:pPr>
+            <w:r>
+              <w:rPr>
+                <w:sz w:val="20"/>
+              </w:rPr>
+              <w:t xml:space="preserve"> </w:t>
+            </w:r>
+          </w:p>
+        </w:tc>
+        <w:tc>
+          <w:tcPr>
+            <w:vAlign w:val="center"/>
+          </w:tcPr>
+          <w:p>
+            <w:pPr>
+              <w:pStyle w:val="Compact"/>
+              <w:keepNext/>
+              <w:jc w:val="center"/>
+            </w:pPr>
+            <w:r>
+              <w:rPr>
+                <w:sz w:val="20"/>
+              </w:rPr>
+              <w:t xml:space="preserve"> </w:t>
+            </w:r>
+          </w:p>
+        </w:tc>
+        <w:tc>
+          <w:tcPr>
+            <w:vAlign w:val="center"/>
+          </w:tcPr>
+          <w:p>
+            <w:pPr>
+              <w:pStyle w:val="Compact"/>
+              <w:keepNext/>
+              <w:jc w:val="center"/>
+            </w:pPr>
+            <w:r>
+              <w:rPr>
+                <w:sz w:val="20"/>
+              </w:rPr>
+              <w:t xml:space="preserve"> </w:t>
+            </w:r>
+          </w:p>
+        </w:tc>
+        <w:tc>
+          <w:tcPr>
+            <w:vAlign w:val="center"/>
+          </w:tcPr>
+          <w:p>
+            <w:pPr>
+              <w:pStyle w:val="Compact"/>
+              <w:keepNext/>
+              <w:jc w:val="center"/>
+            </w:pPr>
+            <w:r>
+              <w:rPr>
+                <w:sz w:val="20"/>
+              </w:rPr>
+              <w:t xml:space="preserve"> </w:t>
+            </w:r>
+          </w:p>
+        </w:tc>
+        <w:tc>
+          <w:tcPr>
+            <w:vAlign w:val="center"/>
+          </w:tcPr>
+          <w:p>
+            <w:pPr>
+              <w:pStyle w:val="Compact"/>
+              <w:keepNext/>
+              <w:jc w:val="center"/>
+            </w:pPr>
+            <w:r>
+              <w:rPr>
+                <w:sz w:val="20"/>
+              </w:rPr>
+              <w:t xml:space="preserve"> </w:t>
+            </w:r>
+          </w:p>
+        </w:tc>
+        <w:tc>
+          <w:tcPr>
+            <w:vAlign w:val="center"/>
+          </w:tcPr>
+          <w:p>
+            <w:pPr>
+              <w:pStyle w:val="Compact"/>
+              <w:keepNext/>
+              <w:jc w:val="center"/>
+            </w:pPr>
+            <w:r>
+              <w:rPr>
+                <w:sz w:val="20"/>
+              </w:rPr>
+              <w:t xml:space="preserve"> </w:t>
+            </w:r>
+          </w:p>
+        </w:tc>
+        <w:tc>
+          <w:tcPr>
+            <w:vAlign w:val="center"/>
+          </w:tcPr>
+          <w:p>
+            <w:pPr>
+              <w:pStyle w:val="Compact"/>
+              <w:keepNext/>
+              <w:jc w:val="center"/>
+            </w:pPr>
+            <w:r>
+              <w:rPr>
+                <w:sz w:val="20"/>
+              </w:rPr>
+              <w:t xml:space="preserve"> </w:t>
+            </w:r>
+          </w:p>
         </w:tc>
       </w:tr>
     </w:tbl>
-    <w:p/>
-    <w:p>
-      <w:pPr>
-        <w:pStyle w:val="BodyText"/>
-        <w:spacing w:before="280" w:after="120" w:line="276" w:lineRule="auto"/>
-        <w:jc w:val="both"/>
-      </w:pPr>
-      <w:r>
-        <w:rPr>
-          <w:bCs/>
-          <w:b/>
-        </w:rPr>
-        <w:t xml:space="preserve">3.</w:t>
-      </w:r>
-      <w:r>
-        <w:t xml:space="preserve"> </w:t>
-      </w:r>
-      <w:r>
-        <w:t xml:space="preserve">Obtenga de cada pendiente la velocidad de propagación</w:t>
-      </w:r>
-      <w:r>
-        <w:t xml:space="preserve"> </w:t>
-      </w:r>
-      <m:oMath>
-        <m:r>
-          <m:t>v</m:t>
-        </m:r>
-        <m:r>
-          <m:rPr>
-            <m:sty m:val="p"/>
-          </m:rPr>
-          <m:t>=</m:t>
-        </m:r>
-        <m:r>
-          <m:t>2</m:t>
-        </m:r>
-        <m:r>
-          <m:t>L</m:t>
-        </m:r>
-        <m:r>
-          <m:rPr>
-            <m:sty m:val="p"/>
-          </m:rPr>
-          <m:t>×</m:t>
-        </m:r>
-      </m:oMath>
-      <w:r>
-        <w:t xml:space="preserve">pendiente, con su error, y compárela con la teórica</w:t>
-      </w:r>
-      <w:r>
-        <w:t xml:space="preserve"> </w:t>
-      </w:r>
-      <m:oMath>
-        <m:r>
-          <m:t>v</m:t>
-        </m:r>
-        <m:r>
-          <m:rPr>
-            <m:sty m:val="p"/>
-          </m:rPr>
-          <m:t>=</m:t>
-        </m:r>
-        <m:r>
-          <m:t>L</m:t>
-        </m:r>
-        <m:rad>
-          <m:radPr>
-            <m:degHide m:val="on"/>
-          </m:radPr>
-          <m:deg/>
-          <m:e>
-            <m:r>
-              <m:t>k</m:t>
-            </m:r>
-            <m:r>
-              <m:rPr>
-                <m:sty m:val="p"/>
-              </m:rPr>
-              <m:t>/</m:t>
-            </m:r>
-            <m:r>
-              <m:t>M</m:t>
-            </m:r>
-          </m:e>
-        </m:rad>
-      </m:oMath>
-      <w:r>
-        <w:t xml:space="preserve">.</w:t>
-      </w:r>
-    </w:p>
-    <w:p>
-      <w:pPr>
-        <w:pStyle w:val="BodyText"/>
-        <w:spacing w:after="120" w:line="276" w:lineRule="auto"/>
-        <w:jc w:val="both"/>
-      </w:pPr>
-      <m:oMath>
-        <m:sSub>
-          <m:e>
-            <m:r>
-              <m:t>v</m:t>
-            </m:r>
-          </m:e>
-          <m:sub>
-            <m:r>
-              <m:t>1</m:t>
-            </m:r>
-          </m:sub>
-        </m:sSub>
-      </m:oMath>
-      <w:r>
-        <w:t xml:space="preserve"> </w:t>
-      </w:r>
-      <w:r>
-        <w:t xml:space="preserve">= ( __________ ± __________ ) m/s</w:t>
-      </w:r>
-      <w:r>
-        <w:t xml:space="preserve"> </w:t>
-      </w:r>
-      <m:oMath>
-        <m:r>
-          <m:t>  </m:t>
-        </m:r>
-        <m:sSub>
-          <m:e>
-            <m:r>
-              <m:t>v</m:t>
-            </m:r>
-          </m:e>
-          <m:sub>
-            <m:r>
-              <m:t>2</m:t>
-            </m:r>
-          </m:sub>
-        </m:sSub>
-      </m:oMath>
-      <w:r>
-        <w:t xml:space="preserve"> </w:t>
-      </w:r>
-      <w:r>
-        <w:t xml:space="preserve">= ( __________ ± __________ ) m/s</w:t>
-      </w:r>
-    </w:p>
-    <w:tbl>
-      <w:tblPr>
-        <w:tblW w:type="pct" w:w="5000"/>
-        <w:tblBorders>
-          <w:top w:val="single" w:sz="6" w:color="000000"/>
-          <w:left w:val="single" w:sz="6" w:color="000000"/>
-          <w:bottom w:val="single" w:sz="6" w:color="000000"/>
-          <w:right w:val="single" w:sz="6" w:color="000000"/>
-          <w:insideH w:val="single" w:sz="6" w:color="000000"/>
-          <w:insideV w:val="single" w:sz="6" w:color="000000"/>
-        </w:tblBorders>
-        <w:tblLook w:firstColumn="1" w:firstRow="1" w:lastColumn="0" w:lastRow="0" w:noHBand="0" w:noVBand="1" w:val="04A0"/>
-      </w:tblPr>
-      <w:tblGrid>
-        <w:gridCol w:w="9524"/>
-      </w:tblGrid>
-      <w:tr>
-        <w:trPr>
-          <w:trHeight w:val="1701" w:hRule="atLeast"/>
-        </w:trPr>
-        <w:tc>
-          <w:tcPr>
-            <w:tcW w:type="dxa" w:w="9524"/>
-          </w:tcPr>
-          <w:p/>
-        </w:tc>
-      </w:tr>
-    </w:tbl>
-    <w:p/>
-    <w:p>
-      <w:pPr>
-        <w:pStyle w:val="BodyText"/>
-        <w:spacing w:before="280" w:after="120" w:line="276" w:lineRule="auto"/>
-        <w:jc w:val="both"/>
-      </w:pPr>
-      <w:r>
-        <w:rPr>
-          <w:bCs/>
-          <w:b/>
-        </w:rPr>
-        <w:t xml:space="preserve">4.</w:t>
-      </w:r>
-      <w:r>
-        <w:t xml:space="preserve"> </w:t>
-      </w:r>
-      <w:r>
-        <w:t xml:space="preserve">¿Depende la frecuencia del modo fundamental de la longitud a la que se estira el muelle? Explíquelo con la fórmula de</w:t>
-      </w:r>
-      <w:r>
-        <w:t xml:space="preserve"> </w:t>
-      </w:r>
-      <m:oMath>
-        <m:sSub>
-          <m:e>
-            <m:r>
-              <m:t>f</m:t>
-            </m:r>
-          </m:e>
-          <m:sub>
-            <m:r>
-              <m:t>1</m:t>
-            </m:r>
-          </m:sub>
-        </m:sSub>
-      </m:oMath>
-      <w:r>
-        <w:t xml:space="preserve">.</w:t>
-      </w:r>
-    </w:p>
-    <w:tbl>
-      <w:tblPr>
-        <w:tblW w:type="pct" w:w="5000"/>
-        <w:tblBorders>
-          <w:top w:val="single" w:sz="6" w:color="000000"/>
-          <w:left w:val="single" w:sz="6" w:color="000000"/>
-          <w:bottom w:val="single" w:sz="6" w:color="000000"/>
-          <w:right w:val="single" w:sz="6" w:color="000000"/>
-          <w:insideH w:val="single" w:sz="6" w:color="000000"/>
-          <w:insideV w:val="single" w:sz="6" w:color="000000"/>
-        </w:tblBorders>
-        <w:tblLook w:firstColumn="1" w:firstRow="1" w:lastColumn="0" w:lastRow="0" w:noHBand="0" w:noVBand="1" w:val="04A0"/>
-      </w:tblPr>
-      <w:tblGrid>
-        <w:gridCol w:w="9524"/>
-      </w:tblGrid>
-      <w:tr>
-        <w:trPr>
-          <w:trHeight w:val="1134" w:hRule="atLeast"/>
-        </w:trPr>
-        <w:tc>
-          <w:tcPr>
-            <w:tcW w:type="dxa" w:w="9524"/>
-          </w:tcPr>
-          <w:p/>
-        </w:tc>
-      </w:tr>
-    </w:tbl>
-    <w:p/>
-    <w:bookmarkEnd w:id="30"/>
+    <w:bookmarkEnd w:id="28"/>
     <w:sectPr>
       <w:headerReference w:type="default" r:id="rId9"/>
       <w:footerReference w:type="default" r:id="rId10"/>

</xml_diff>